<commit_message>
docs: fix the pPr element order that was dropping the front headings from navigation
Table of Tables and Table of Figures were given an outline level so they would
appear in the navigation pane, and it had no effect: the level was written into
w:pPr before w:jc, and children of w:pPr have to appear in the order the schema
declares. WPS ignored the out-of-place element rather than rejecting the file, so
the document opened cleanly and the headings were simply absent. Order is now
pStyle, ind, jc, outlineLvl.

Table of Contents was missing for a different reason: pandoc styles it TOCHeading,
whose definition carries outline level 9 -- body text -- so it was never an
outline entry at all. Promoted to level 0 to match the two below it.

All three now carry outlineLvl 0 in the right position.
</commit_message>
<xml_diff>
--- a/doc/QNSC_Interrupt_Map_MAS.docx
+++ b/doc/QNSC_Interrupt_Map_MAS.docx
@@ -42,6 +42,7 @@
         <w:p>
           <w:pPr>
             <w:pStyle w:val="TOCHeading"/>
+            <w:outlineLvl w:val="0"/>
           </w:pPr>
           <w:r>
             <w:t xml:space="preserve">Table of Contents</w:t>
@@ -58,8 +59,8 @@
         <w:p>
           <w:pPr>
             <w:pStyle w:val="Heading1"/>
+            <w:jc w:val="left"/>
             <w:outlineLvl w:val="0"/>
-            <w:jc w:val="left"/>
           </w:pPr>
           <w:r>
             <w:t xml:space="preserve">Table of Tables</w:t>
@@ -168,8 +169,8 @@
         <w:p>
           <w:pPr>
             <w:pStyle w:val="Heading1"/>
+            <w:jc w:val="left"/>
             <w:outlineLvl w:val="0"/>
-            <w:jc w:val="left"/>
           </w:pPr>
           <w:r>
             <w:t xml:space="preserve">Table of Figures</w:t>

</xml_diff>

<commit_message>
docs: cut the revision table to the current version
Twenty-two rows came to 13% of the document and sat in front of section 1 -- the
same proportion the prose changelog had in the file this replaced, so on that
measure the rewrite had gained nothing.

V2.0 is a rewrite, so the table starts again at it. The twenty versions before
describe a document that no longer exists in this shape, and they are already in
_DECISIONS in full with the reasoning and evidence behind each, so nothing is
lost by not repeating them here. Two rows now, 1% of the document.

The template records the rule and the measurement, so the next block does not
arrive at the same 13% by writing one row per version from the start.
</commit_message>
<xml_diff>
--- a/doc/QNSC_Interrupt_Map_MAS.docx
+++ b/doc/QNSC_Interrupt_Map_MAS.docx
@@ -341,13 +341,55 @@
         <w:pStyle w:val="FirstParagraph"/>
       </w:pPr>
       <w:r>
-        <w:t xml:space="preserve">One line per version. The reasoning behind each change, and the evidence it rests</w:t>
+        <w:rPr>
+          <w:rStyle w:val="VerbatimChar"/>
+        </w:rPr>
+        <w:t xml:space="preserve">V2.0</w:t>
       </w:r>
       <w:r>
         <w:t xml:space="preserve"> </w:t>
       </w:r>
       <w:r>
-        <w:t xml:space="preserve">on, is in</w:t>
+        <w:t xml:space="preserve">is a rewrite, so the history starts again here. The twenty versions before</w:t>
+      </w:r>
+      <w:r>
+        <w:t xml:space="preserve"> </w:t>
+      </w:r>
+      <w:r>
+        <w:t xml:space="preserve">it,</w:t>
+      </w:r>
+      <w:r>
+        <w:t xml:space="preserve"> </w:t>
+      </w:r>
+      <w:r>
+        <w:rPr>
+          <w:rStyle w:val="VerbatimChar"/>
+        </w:rPr>
+        <w:t xml:space="preserve">V1.0</w:t>
+      </w:r>
+      <w:r>
+        <w:t xml:space="preserve"> </w:t>
+      </w:r>
+      <w:r>
+        <w:t xml:space="preserve">to</w:t>
+      </w:r>
+      <w:r>
+        <w:t xml:space="preserve"> </w:t>
+      </w:r>
+      <w:r>
+        <w:rPr>
+          <w:rStyle w:val="VerbatimChar"/>
+        </w:rPr>
+        <w:t xml:space="preserve">V11.10</w:t>
+      </w:r>
+      <w:r>
+        <w:t xml:space="preserve">, describe a document that no longer exists in this shape;</w:t>
+      </w:r>
+      <w:r>
+        <w:t xml:space="preserve"> </w:t>
+      </w:r>
+      <w:r>
+        <w:t xml:space="preserve">they are listed in full, with the reasoning and the evidence behind each, in</w:t>
       </w:r>
       <w:r>
         <w:t xml:space="preserve"> </w:t>
@@ -452,19 +494,19 @@
               <w:jc w:val="left"/>
             </w:pPr>
             <w:r>
-              <w:t xml:space="preserve">V1.0</w:t>
-            </w:r>
-          </w:p>
-        </w:tc>
-        <w:tc>
-          <w:tcPr/>
-          <w:p>
-            <w:pPr>
-              <w:pStyle w:val="Compact"/>
-              <w:jc w:val="left"/>
-            </w:pPr>
-            <w:r>
-              <w:t xml:space="preserve">2026-09-13</w:t>
+              <w:t xml:space="preserve">V2.0</w:t>
+            </w:r>
+          </w:p>
+        </w:tc>
+        <w:tc>
+          <w:tcPr/>
+          <w:p>
+            <w:pPr>
+              <w:pStyle w:val="Compact"/>
+              <w:jc w:val="left"/>
+            </w:pPr>
+            <w:r>
+              <w:t xml:space="preserve">2026-09-23</w:t>
             </w:r>
           </w:p>
         </w:tc>
@@ -500,317 +542,7 @@
               <w:jc w:val="left"/>
             </w:pPr>
             <w:r>
-              <w:t xml:space="preserve">First issue, against a candidate IP set: 74 sources</w:t>
-            </w:r>
-          </w:p>
-        </w:tc>
-      </w:tr>
-      <w:tr>
-        <w:tc>
-          <w:tcPr/>
-          <w:p>
-            <w:pPr>
-              <w:pStyle w:val="Compact"/>
-              <w:jc w:val="left"/>
-            </w:pPr>
-            <w:r>
-              <w:t xml:space="preserve">V2.0</w:t>
-            </w:r>
-          </w:p>
-        </w:tc>
-        <w:tc>
-          <w:tcPr/>
-          <w:p>
-            <w:pPr>
-              <w:pStyle w:val="Compact"/>
-              <w:jc w:val="left"/>
-            </w:pPr>
-            <w:r>
-              <w:t xml:space="preserve">2026-09-17</w:t>
-            </w:r>
-          </w:p>
-        </w:tc>
-        <w:tc>
-          <w:tcPr/>
-          <w:p>
-            <w:pPr>
-              <w:pStyle w:val="Compact"/>
-              <w:jc w:val="left"/>
-            </w:pPr>
-            <w:r>
-              <w:t xml:space="preserve">Nghia VT</w:t>
-            </w:r>
-          </w:p>
-        </w:tc>
-        <w:tc>
-          <w:tcPr/>
-          <w:p>
-            <w:pPr>
-              <w:pStyle w:val="Compact"/>
-              <w:jc w:val="left"/>
-            </w:pPr>
-            <w:r>
-              <w:t xml:space="preserve">–</w:t>
-            </w:r>
-          </w:p>
-        </w:tc>
-        <w:tc>
-          <w:tcPr/>
-          <w:p>
-            <w:pPr>
-              <w:pStyle w:val="Compact"/>
-              <w:jc w:val="left"/>
-            </w:pPr>
-            <w:r>
-              <w:t xml:space="preserve">Rewritten for the IP set actually selected: 28</w:t>
-            </w:r>
-          </w:p>
-        </w:tc>
-      </w:tr>
-      <w:tr>
-        <w:tc>
-          <w:tcPr/>
-          <w:p>
-            <w:pPr>
-              <w:pStyle w:val="Compact"/>
-              <w:jc w:val="left"/>
-            </w:pPr>
-            <w:r>
-              <w:t xml:space="preserve">V3.0</w:t>
-            </w:r>
-          </w:p>
-        </w:tc>
-        <w:tc>
-          <w:tcPr/>
-          <w:p>
-            <w:pPr>
-              <w:pStyle w:val="Compact"/>
-              <w:jc w:val="left"/>
-            </w:pPr>
-            <w:r>
-              <w:t xml:space="preserve">2026-09-17</w:t>
-            </w:r>
-          </w:p>
-        </w:tc>
-        <w:tc>
-          <w:tcPr/>
-          <w:p>
-            <w:pPr>
-              <w:pStyle w:val="Compact"/>
-              <w:jc w:val="left"/>
-            </w:pPr>
-            <w:r>
-              <w:t xml:space="preserve">Nghia VT</w:t>
-            </w:r>
-          </w:p>
-        </w:tc>
-        <w:tc>
-          <w:tcPr/>
-          <w:p>
-            <w:pPr>
-              <w:pStyle w:val="Compact"/>
-              <w:jc w:val="left"/>
-            </w:pPr>
-            <w:r>
-              <w:t xml:space="preserve">–</w:t>
-            </w:r>
-          </w:p>
-        </w:tc>
-        <w:tc>
-          <w:tcPr/>
-          <w:p>
-            <w:pPr>
-              <w:pStyle w:val="Compact"/>
-              <w:jc w:val="left"/>
-            </w:pPr>
-            <w:r>
-              <w:t xml:space="preserve">Specified as registered, wrongly – see V11.3</w:t>
-            </w:r>
-          </w:p>
-        </w:tc>
-      </w:tr>
-      <w:tr>
-        <w:tc>
-          <w:tcPr/>
-          <w:p>
-            <w:pPr>
-              <w:pStyle w:val="Compact"/>
-              <w:jc w:val="left"/>
-            </w:pPr>
-            <w:r>
-              <w:t xml:space="preserve">V4.0</w:t>
-            </w:r>
-          </w:p>
-        </w:tc>
-        <w:tc>
-          <w:tcPr/>
-          <w:p>
-            <w:pPr>
-              <w:pStyle w:val="Compact"/>
-              <w:jc w:val="left"/>
-            </w:pPr>
-            <w:r>
-              <w:t xml:space="preserve">2026-09-17</w:t>
-            </w:r>
-          </w:p>
-        </w:tc>
-        <w:tc>
-          <w:tcPr/>
-          <w:p>
-            <w:pPr>
-              <w:pStyle w:val="Compact"/>
-              <w:jc w:val="left"/>
-            </w:pPr>
-            <w:r>
-              <w:t xml:space="preserve">Nghia VT</w:t>
-            </w:r>
-          </w:p>
-        </w:tc>
-        <w:tc>
-          <w:tcPr/>
-          <w:p>
-            <w:pPr>
-              <w:pStyle w:val="Compact"/>
-              <w:jc w:val="left"/>
-            </w:pPr>
-            <w:r>
-              <w:t xml:space="preserve">–</w:t>
-            </w:r>
-          </w:p>
-        </w:tc>
-        <w:tc>
-          <w:tcPr/>
-          <w:p>
-            <w:pPr>
-              <w:pStyle w:val="Compact"/>
-              <w:jc w:val="left"/>
-            </w:pPr>
-            <w:r>
-              <w:t xml:space="preserve">Port list and parameters added; derived figures reconciled</w:t>
-            </w:r>
-          </w:p>
-        </w:tc>
-      </w:tr>
-      <w:tr>
-        <w:tc>
-          <w:tcPr/>
-          <w:p>
-            <w:pPr>
-              <w:pStyle w:val="Compact"/>
-              <w:jc w:val="left"/>
-            </w:pPr>
-            <w:r>
-              <w:t xml:space="preserve">V5.0</w:t>
-            </w:r>
-          </w:p>
-        </w:tc>
-        <w:tc>
-          <w:tcPr/>
-          <w:p>
-            <w:pPr>
-              <w:pStyle w:val="Compact"/>
-              <w:jc w:val="left"/>
-            </w:pPr>
-            <w:r>
-              <w:t xml:space="preserve">2026-09-17</w:t>
-            </w:r>
-          </w:p>
-        </w:tc>
-        <w:tc>
-          <w:tcPr/>
-          <w:p>
-            <w:pPr>
-              <w:pStyle w:val="Compact"/>
-              <w:jc w:val="left"/>
-            </w:pPr>
-            <w:r>
-              <w:t xml:space="preserve">Nghia VT</w:t>
-            </w:r>
-          </w:p>
-        </w:tc>
-        <w:tc>
-          <w:tcPr/>
-          <w:p>
-            <w:pPr>
-              <w:pStyle w:val="Compact"/>
-              <w:jc w:val="left"/>
-            </w:pPr>
-            <w:r>
-              <w:t xml:space="preserve">–</w:t>
-            </w:r>
-          </w:p>
-        </w:tc>
-        <w:tc>
-          <w:tcPr/>
-          <w:p>
-            <w:pPr>
-              <w:pStyle w:val="Compact"/>
-              <w:jc w:val="left"/>
-            </w:pPr>
-            <w:r>
-              <w:t xml:space="preserve">Audited against the IP assignment sheet and each IP’s RTL</w:t>
-            </w:r>
-          </w:p>
-        </w:tc>
-      </w:tr>
-      <w:tr>
-        <w:tc>
-          <w:tcPr/>
-          <w:p>
-            <w:pPr>
-              <w:pStyle w:val="Compact"/>
-              <w:jc w:val="left"/>
-            </w:pPr>
-            <w:r>
-              <w:t xml:space="preserve">V6.0</w:t>
-            </w:r>
-          </w:p>
-        </w:tc>
-        <w:tc>
-          <w:tcPr/>
-          <w:p>
-            <w:pPr>
-              <w:pStyle w:val="Compact"/>
-              <w:jc w:val="left"/>
-            </w:pPr>
-            <w:r>
-              <w:t xml:space="preserve">2026-09-17</w:t>
-            </w:r>
-          </w:p>
-        </w:tc>
-        <w:tc>
-          <w:tcPr/>
-          <w:p>
-            <w:pPr>
-              <w:pStyle w:val="Compact"/>
-              <w:jc w:val="left"/>
-            </w:pPr>
-            <w:r>
-              <w:t xml:space="preserve">Nghia VT</w:t>
-            </w:r>
-          </w:p>
-        </w:tc>
-        <w:tc>
-          <w:tcPr/>
-          <w:p>
-            <w:pPr>
-              <w:pStyle w:val="Compact"/>
-              <w:jc w:val="left"/>
-            </w:pPr>
-            <w:r>
-              <w:t xml:space="preserve">–</w:t>
-            </w:r>
-          </w:p>
-        </w:tc>
-        <w:tc>
-          <w:tcPr/>
-          <w:p>
-            <w:pPr>
-              <w:pStyle w:val="Compact"/>
-              <w:jc w:val="left"/>
-            </w:pPr>
-            <w:r>
-              <w:t xml:space="preserve">GPIO corrected to</w:t>
+              <w:t xml:space="preserve">Rewritten as specification only: 1284 lines to 327. History and reasoning moved to</w:t>
             </w:r>
             <w:r>
               <w:t xml:space="preserve"> </w:t>
@@ -819,1058 +551,17 @@
               <w:rPr>
                 <w:rStyle w:val="VerbatimChar"/>
               </w:rPr>
-              <w:t xml:space="preserve">pulp-platform/apb_gpio</w:t>
-            </w:r>
-            <w:r>
-              <w:t xml:space="preserve">: total 27</w:t>
-            </w:r>
-          </w:p>
-        </w:tc>
-      </w:tr>
-      <w:tr>
-        <w:tc>
-          <w:tcPr/>
-          <w:p>
-            <w:pPr>
-              <w:pStyle w:val="Compact"/>
-              <w:jc w:val="left"/>
-            </w:pPr>
-            <w:r>
-              <w:t xml:space="preserve">V7.0</w:t>
-            </w:r>
-          </w:p>
-        </w:tc>
-        <w:tc>
-          <w:tcPr/>
-          <w:p>
-            <w:pPr>
-              <w:pStyle w:val="Compact"/>
-              <w:jc w:val="left"/>
-            </w:pPr>
-            <w:r>
-              <w:t xml:space="preserve">2026-09-17</w:t>
-            </w:r>
-          </w:p>
-        </w:tc>
-        <w:tc>
-          <w:tcPr/>
-          <w:p>
-            <w:pPr>
-              <w:pStyle w:val="Compact"/>
-              <w:jc w:val="left"/>
-            </w:pPr>
-            <w:r>
-              <w:t xml:space="preserve">Nghia VT</w:t>
-            </w:r>
-          </w:p>
-        </w:tc>
-        <w:tc>
-          <w:tcPr/>
-          <w:p>
-            <w:pPr>
-              <w:pStyle w:val="Compact"/>
-              <w:jc w:val="left"/>
-            </w:pPr>
-            <w:r>
-              <w:t xml:space="preserve">–</w:t>
-            </w:r>
-          </w:p>
-        </w:tc>
-        <w:tc>
-          <w:tcPr/>
-          <w:p>
-            <w:pPr>
-              <w:pStyle w:val="Compact"/>
-              <w:jc w:val="left"/>
-            </w:pPr>
+              <w:t xml:space="preserve">_DECISIONS</w:t>
+            </w:r>
+            <w:r>
+              <w:t xml:space="preserve">. Tables in 7.2, 7.3 and 10 generated from</w:t>
+            </w:r>
+            <w:r>
+              <w:t xml:space="preserve"> </w:t>
+            </w:r>
             <w:r>
               <w:rPr>
                 <w:rStyle w:val="VerbatimChar"/>
-              </w:rPr>
-              <w:t xml:space="preserve">rv_plic</w:t>
-            </w:r>
-            <w:r>
-              <w:t xml:space="preserve"> </w:t>
-            </w:r>
-            <w:r>
-              <w:t xml:space="preserve">considered and rejected; Ibex fast lines kept</w:t>
-            </w:r>
-          </w:p>
-        </w:tc>
-      </w:tr>
-      <w:tr>
-        <w:tc>
-          <w:tcPr/>
-          <w:p>
-            <w:pPr>
-              <w:pStyle w:val="Compact"/>
-              <w:jc w:val="left"/>
-            </w:pPr>
-            <w:r>
-              <w:t xml:space="preserve">V9.0</w:t>
-            </w:r>
-          </w:p>
-        </w:tc>
-        <w:tc>
-          <w:tcPr/>
-          <w:p>
-            <w:pPr>
-              <w:pStyle w:val="Compact"/>
-              <w:jc w:val="left"/>
-            </w:pPr>
-            <w:r>
-              <w:t xml:space="preserve">2026-09-18</w:t>
-            </w:r>
-          </w:p>
-        </w:tc>
-        <w:tc>
-          <w:tcPr/>
-          <w:p>
-            <w:pPr>
-              <w:pStyle w:val="Compact"/>
-              <w:jc w:val="left"/>
-            </w:pPr>
-            <w:r>
-              <w:t xml:space="preserve">Nghia VT</w:t>
-            </w:r>
-          </w:p>
-        </w:tc>
-        <w:tc>
-          <w:tcPr/>
-          <w:p>
-            <w:pPr>
-              <w:pStyle w:val="Compact"/>
-              <w:jc w:val="left"/>
-            </w:pPr>
-            <w:r>
-              <w:t xml:space="preserve">–</w:t>
-            </w:r>
-          </w:p>
-        </w:tc>
-        <w:tc>
-          <w:tcPr/>
-          <w:p>
-            <w:pPr>
-              <w:pStyle w:val="Compact"/>
-              <w:jc w:val="left"/>
-            </w:pPr>
-            <w:r>
-              <w:t xml:space="preserve">Reconciled against</w:t>
-            </w:r>
-            <w:r>
-              <w:t xml:space="preserve"> </w:t>
-            </w:r>
-            <w:r>
-              <w:rPr>
-                <w:rStyle w:val="VerbatimChar"/>
-              </w:rPr>
-              <w:t xml:space="preserve">QSOC_HAS</w:t>
-            </w:r>
-            <w:r>
-              <w:t xml:space="preserve"> </w:t>
-            </w:r>
-            <w:r>
-              <w:t xml:space="preserve">and the DMA, TIMER, WDT specs</w:t>
-            </w:r>
-          </w:p>
-        </w:tc>
-      </w:tr>
-      <w:tr>
-        <w:tc>
-          <w:tcPr/>
-          <w:p>
-            <w:pPr>
-              <w:pStyle w:val="Compact"/>
-              <w:jc w:val="left"/>
-            </w:pPr>
-            <w:r>
-              <w:t xml:space="preserve">V10.0</w:t>
-            </w:r>
-          </w:p>
-        </w:tc>
-        <w:tc>
-          <w:tcPr/>
-          <w:p>
-            <w:pPr>
-              <w:pStyle w:val="Compact"/>
-              <w:jc w:val="left"/>
-            </w:pPr>
-            <w:r>
-              <w:t xml:space="preserve">2026-09-18</w:t>
-            </w:r>
-          </w:p>
-        </w:tc>
-        <w:tc>
-          <w:tcPr/>
-          <w:p>
-            <w:pPr>
-              <w:pStyle w:val="Compact"/>
-              <w:jc w:val="left"/>
-            </w:pPr>
-            <w:r>
-              <w:t xml:space="preserve">Nghia VT</w:t>
-            </w:r>
-          </w:p>
-        </w:tc>
-        <w:tc>
-          <w:tcPr/>
-          <w:p>
-            <w:pPr>
-              <w:pStyle w:val="Compact"/>
-              <w:jc w:val="left"/>
-            </w:pPr>
-            <w:r>
-              <w:t xml:space="preserve">–</w:t>
-            </w:r>
-          </w:p>
-        </w:tc>
-        <w:tc>
-          <w:tcPr/>
-          <w:p>
-            <w:pPr>
-              <w:pStyle w:val="Compact"/>
-              <w:jc w:val="left"/>
-            </w:pPr>
-            <w:r>
-              <w:rPr>
-                <w:rStyle w:val="VerbatimChar"/>
-              </w:rPr>
-              <w:t xml:space="preserve">QSOC_HAS</w:t>
-            </w:r>
-            <w:r>
-              <w:t xml:space="preserve"> </w:t>
-            </w:r>
-            <w:r>
-              <w:t xml:space="preserve">v4_r1 settles four open items, all in favour of this</w:t>
-            </w:r>
-          </w:p>
-        </w:tc>
-      </w:tr>
-      <w:tr>
-        <w:tc>
-          <w:tcPr/>
-          <w:p>
-            <w:pPr>
-              <w:pStyle w:val="Compact"/>
-              <w:jc w:val="left"/>
-            </w:pPr>
-            <w:r>
-              <w:t xml:space="preserve">V10.1</w:t>
-            </w:r>
-          </w:p>
-        </w:tc>
-        <w:tc>
-          <w:tcPr/>
-          <w:p>
-            <w:pPr>
-              <w:pStyle w:val="Compact"/>
-              <w:jc w:val="left"/>
-            </w:pPr>
-            <w:r>
-              <w:t xml:space="preserve">2026-09-18</w:t>
-            </w:r>
-          </w:p>
-        </w:tc>
-        <w:tc>
-          <w:tcPr/>
-          <w:p>
-            <w:pPr>
-              <w:pStyle w:val="Compact"/>
-              <w:jc w:val="left"/>
-            </w:pPr>
-            <w:r>
-              <w:t xml:space="preserve">Nghia VT</w:t>
-            </w:r>
-          </w:p>
-        </w:tc>
-        <w:tc>
-          <w:tcPr/>
-          <w:p>
-            <w:pPr>
-              <w:pStyle w:val="Compact"/>
-              <w:jc w:val="left"/>
-            </w:pPr>
-            <w:r>
-              <w:t xml:space="preserve">–</w:t>
-            </w:r>
-          </w:p>
-        </w:tc>
-        <w:tc>
-          <w:tcPr/>
-          <w:p>
-            <w:pPr>
-              <w:pStyle w:val="Compact"/>
-              <w:jc w:val="left"/>
-            </w:pPr>
-            <w:r>
-              <w:t xml:space="preserve">Two source counts closed; one correction here</w:t>
-            </w:r>
-          </w:p>
-        </w:tc>
-      </w:tr>
-      <w:tr>
-        <w:tc>
-          <w:tcPr/>
-          <w:p>
-            <w:pPr>
-              <w:pStyle w:val="Compact"/>
-              <w:jc w:val="left"/>
-            </w:pPr>
-            <w:r>
-              <w:t xml:space="preserve">V11.1</w:t>
-            </w:r>
-          </w:p>
-        </w:tc>
-        <w:tc>
-          <w:tcPr/>
-          <w:p>
-            <w:pPr>
-              <w:pStyle w:val="Compact"/>
-              <w:jc w:val="left"/>
-            </w:pPr>
-            <w:r>
-              <w:t xml:space="preserve">2026-09-21</w:t>
-            </w:r>
-          </w:p>
-        </w:tc>
-        <w:tc>
-          <w:tcPr/>
-          <w:p>
-            <w:pPr>
-              <w:pStyle w:val="Compact"/>
-              <w:jc w:val="left"/>
-            </w:pPr>
-            <w:r>
-              <w:t xml:space="preserve">Nghia VT</w:t>
-            </w:r>
-          </w:p>
-        </w:tc>
-        <w:tc>
-          <w:tcPr/>
-          <w:p>
-            <w:pPr>
-              <w:pStyle w:val="Compact"/>
-              <w:jc w:val="left"/>
-            </w:pPr>
-            <w:r>
-              <w:t xml:space="preserve">–</w:t>
-            </w:r>
-          </w:p>
-        </w:tc>
-        <w:tc>
-          <w:tcPr/>
-          <w:p>
-            <w:pPr>
-              <w:pStyle w:val="Compact"/>
-              <w:jc w:val="left"/>
-            </w:pPr>
-            <w:r>
-              <w:t xml:space="preserve">TIMER0, TIMER1, PWM ownership transfers in; each gets its own MAS</w:t>
-            </w:r>
-          </w:p>
-        </w:tc>
-      </w:tr>
-      <w:tr>
-        <w:tc>
-          <w:tcPr/>
-          <w:p>
-            <w:pPr>
-              <w:pStyle w:val="Compact"/>
-              <w:jc w:val="left"/>
-            </w:pPr>
-            <w:r>
-              <w:t xml:space="preserve">V11.2</w:t>
-            </w:r>
-          </w:p>
-        </w:tc>
-        <w:tc>
-          <w:tcPr/>
-          <w:p>
-            <w:pPr>
-              <w:pStyle w:val="Compact"/>
-              <w:jc w:val="left"/>
-            </w:pPr>
-            <w:r>
-              <w:t xml:space="preserve">2026-09-21</w:t>
-            </w:r>
-          </w:p>
-        </w:tc>
-        <w:tc>
-          <w:tcPr/>
-          <w:p>
-            <w:pPr>
-              <w:pStyle w:val="Compact"/>
-              <w:jc w:val="left"/>
-            </w:pPr>
-            <w:r>
-              <w:t xml:space="preserve">Nghia VT</w:t>
-            </w:r>
-          </w:p>
-        </w:tc>
-        <w:tc>
-          <w:tcPr/>
-          <w:p>
-            <w:pPr>
-              <w:pStyle w:val="Compact"/>
-              <w:jc w:val="left"/>
-            </w:pPr>
-            <w:r>
-              <w:t xml:space="preserve">Day005</w:t>
-            </w:r>
-          </w:p>
-        </w:tc>
-        <w:tc>
-          <w:tcPr/>
-          <w:p>
-            <w:pPr>
-              <w:pStyle w:val="Compact"/>
-              <w:jc w:val="left"/>
-            </w:pPr>
-            <w:r>
-              <w:t xml:space="preserve">GPIO ruled one line for four instances – action item closed</w:t>
-            </w:r>
-          </w:p>
-        </w:tc>
-      </w:tr>
-      <w:tr>
-        <w:tc>
-          <w:tcPr/>
-          <w:p>
-            <w:pPr>
-              <w:pStyle w:val="Compact"/>
-              <w:jc w:val="left"/>
-            </w:pPr>
-            <w:r>
-              <w:t xml:space="preserve">V11.3</w:t>
-            </w:r>
-          </w:p>
-        </w:tc>
-        <w:tc>
-          <w:tcPr/>
-          <w:p>
-            <w:pPr>
-              <w:pStyle w:val="Compact"/>
-              <w:jc w:val="left"/>
-            </w:pPr>
-            <w:r>
-              <w:t xml:space="preserve">2026-09-21</w:t>
-            </w:r>
-          </w:p>
-        </w:tc>
-        <w:tc>
-          <w:tcPr/>
-          <w:p>
-            <w:pPr>
-              <w:pStyle w:val="Compact"/>
-              <w:jc w:val="left"/>
-            </w:pPr>
-            <w:r>
-              <w:t xml:space="preserve">Nghia VT</w:t>
-            </w:r>
-          </w:p>
-        </w:tc>
-        <w:tc>
-          <w:tcPr/>
-          <w:p>
-            <w:pPr>
-              <w:pStyle w:val="Compact"/>
-              <w:jc w:val="left"/>
-            </w:pPr>
-            <w:r>
-              <w:t xml:space="preserve">–</w:t>
-            </w:r>
-          </w:p>
-        </w:tc>
-        <w:tc>
-          <w:tcPr/>
-          <w:p>
-            <w:pPr>
-              <w:pStyle w:val="Compact"/>
-              <w:jc w:val="left"/>
-            </w:pPr>
-            <w:r>
-              <w:t xml:space="preserve">Five questions closed from Ibex RTL.</w:t>
-            </w:r>
-            <w:r>
-              <w:t xml:space="preserve"> </w:t>
-            </w:r>
-            <w:r>
-              <w:rPr>
-                <w:b/>
-                <w:bCs/>
-              </w:rPr>
-              <w:t xml:space="preserve">Block is combinational</w:t>
-            </w:r>
-          </w:p>
-        </w:tc>
-      </w:tr>
-      <w:tr>
-        <w:tc>
-          <w:tcPr/>
-          <w:p>
-            <w:pPr>
-              <w:pStyle w:val="Compact"/>
-              <w:jc w:val="left"/>
-            </w:pPr>
-            <w:r>
-              <w:t xml:space="preserve">V11.4</w:t>
-            </w:r>
-          </w:p>
-        </w:tc>
-        <w:tc>
-          <w:tcPr/>
-          <w:p>
-            <w:pPr>
-              <w:pStyle w:val="Compact"/>
-              <w:jc w:val="left"/>
-            </w:pPr>
-            <w:r>
-              <w:t xml:space="preserve">2026-09-22</w:t>
-            </w:r>
-          </w:p>
-        </w:tc>
-        <w:tc>
-          <w:tcPr/>
-          <w:p>
-            <w:pPr>
-              <w:pStyle w:val="Compact"/>
-              <w:jc w:val="left"/>
-            </w:pPr>
-            <w:r>
-              <w:t xml:space="preserve">Nghia VT</w:t>
-            </w:r>
-          </w:p>
-        </w:tc>
-        <w:tc>
-          <w:tcPr/>
-          <w:p>
-            <w:pPr>
-              <w:pStyle w:val="Compact"/>
-              <w:jc w:val="left"/>
-            </w:pPr>
-            <w:r>
-              <w:t xml:space="preserve">–</w:t>
-            </w:r>
-          </w:p>
-        </w:tc>
-        <w:tc>
-          <w:tcPr/>
-          <w:p>
-            <w:pPr>
-              <w:pStyle w:val="Compact"/>
-              <w:jc w:val="left"/>
-            </w:pPr>
-            <w:r>
-              <w:t xml:space="preserve">Question 2 reframed after reading the bus owner’s three specs</w:t>
-            </w:r>
-          </w:p>
-        </w:tc>
-      </w:tr>
-      <w:tr>
-        <w:tc>
-          <w:tcPr/>
-          <w:p>
-            <w:pPr>
-              <w:pStyle w:val="Compact"/>
-              <w:jc w:val="left"/>
-            </w:pPr>
-            <w:r>
-              <w:t xml:space="preserve">V11.5</w:t>
-            </w:r>
-          </w:p>
-        </w:tc>
-        <w:tc>
-          <w:tcPr/>
-          <w:p>
-            <w:pPr>
-              <w:pStyle w:val="Compact"/>
-              <w:jc w:val="left"/>
-            </w:pPr>
-            <w:r>
-              <w:t xml:space="preserve">2026-09-22</w:t>
-            </w:r>
-          </w:p>
-        </w:tc>
-        <w:tc>
-          <w:tcPr/>
-          <w:p>
-            <w:pPr>
-              <w:pStyle w:val="Compact"/>
-              <w:jc w:val="left"/>
-            </w:pPr>
-            <w:r>
-              <w:t xml:space="preserve">Nghia VT</w:t>
-            </w:r>
-          </w:p>
-        </w:tc>
-        <w:tc>
-          <w:tcPr/>
-          <w:p>
-            <w:pPr>
-              <w:pStyle w:val="Compact"/>
-              <w:jc w:val="left"/>
-            </w:pPr>
-            <w:r>
-              <w:t xml:space="preserve">–</w:t>
-            </w:r>
-          </w:p>
-        </w:tc>
-        <w:tc>
-          <w:tcPr/>
-          <w:p>
-            <w:pPr>
-              <w:pStyle w:val="Compact"/>
-              <w:jc w:val="left"/>
-            </w:pPr>
-            <w:r>
-              <w:t xml:space="preserve">Question 2 rewritten from the IPs’ RTL, not</w:t>
-            </w:r>
-            <w:r>
-              <w:t xml:space="preserve"> </w:t>
-            </w:r>
-            <w:r>
-              <w:rPr>
-                <w:rStyle w:val="VerbatimChar"/>
-              </w:rPr>
-              <w:t xml:space="preserve">QSOC_HAS</w:t>
-            </w:r>
-          </w:p>
-        </w:tc>
-      </w:tr>
-      <w:tr>
-        <w:tc>
-          <w:tcPr/>
-          <w:p>
-            <w:pPr>
-              <w:pStyle w:val="Compact"/>
-              <w:jc w:val="left"/>
-            </w:pPr>
-            <w:r>
-              <w:t xml:space="preserve">V11.6</w:t>
-            </w:r>
-          </w:p>
-        </w:tc>
-        <w:tc>
-          <w:tcPr/>
-          <w:p>
-            <w:pPr>
-              <w:pStyle w:val="Compact"/>
-              <w:jc w:val="left"/>
-            </w:pPr>
-            <w:r>
-              <w:t xml:space="preserve">2026-09-22</w:t>
-            </w:r>
-          </w:p>
-        </w:tc>
-        <w:tc>
-          <w:tcPr/>
-          <w:p>
-            <w:pPr>
-              <w:pStyle w:val="Compact"/>
-              <w:jc w:val="left"/>
-            </w:pPr>
-            <w:r>
-              <w:t xml:space="preserve">Nghia VT</w:t>
-            </w:r>
-          </w:p>
-        </w:tc>
-        <w:tc>
-          <w:tcPr/>
-          <w:p>
-            <w:pPr>
-              <w:pStyle w:val="Compact"/>
-              <w:jc w:val="left"/>
-            </w:pPr>
-            <w:r>
-              <w:t xml:space="preserve">–</w:t>
-            </w:r>
-          </w:p>
-        </w:tc>
-        <w:tc>
-          <w:tcPr/>
-          <w:p>
-            <w:pPr>
-              <w:pStyle w:val="Compact"/>
-              <w:jc w:val="left"/>
-            </w:pPr>
-            <w:r>
-              <w:t xml:space="preserve">Two questions closed, one narrowed, from the SPI owner’s specs</w:t>
-            </w:r>
-          </w:p>
-        </w:tc>
-      </w:tr>
-      <w:tr>
-        <w:tc>
-          <w:tcPr/>
-          <w:p>
-            <w:pPr>
-              <w:pStyle w:val="Compact"/>
-              <w:jc w:val="left"/>
-            </w:pPr>
-            <w:r>
-              <w:t xml:space="preserve">V11.7</w:t>
-            </w:r>
-          </w:p>
-        </w:tc>
-        <w:tc>
-          <w:tcPr/>
-          <w:p>
-            <w:pPr>
-              <w:pStyle w:val="Compact"/>
-              <w:jc w:val="left"/>
-            </w:pPr>
-            <w:r>
-              <w:t xml:space="preserve">2026-09-22</w:t>
-            </w:r>
-          </w:p>
-        </w:tc>
-        <w:tc>
-          <w:tcPr/>
-          <w:p>
-            <w:pPr>
-              <w:pStyle w:val="Compact"/>
-              <w:jc w:val="left"/>
-            </w:pPr>
-            <w:r>
-              <w:t xml:space="preserve">Nghia VT</w:t>
-            </w:r>
-          </w:p>
-        </w:tc>
-        <w:tc>
-          <w:tcPr/>
-          <w:p>
-            <w:pPr>
-              <w:pStyle w:val="Compact"/>
-              <w:jc w:val="left"/>
-            </w:pPr>
-            <w:r>
-              <w:t xml:space="preserve">–</w:t>
-            </w:r>
-          </w:p>
-        </w:tc>
-        <w:tc>
-          <w:tcPr/>
-          <w:p>
-            <w:pPr>
-              <w:pStyle w:val="Compact"/>
-              <w:jc w:val="left"/>
-            </w:pPr>
-            <w:r>
-              <w:t xml:space="preserve">Stale reset-cause table corrected:</w:t>
-            </w:r>
-            <w:r>
-              <w:t xml:space="preserve"> </w:t>
-            </w:r>
-            <w:r>
-              <w:rPr>
-                <w:rStyle w:val="VerbatimChar"/>
-              </w:rPr>
-              <w:t xml:space="preserve">ndmreset</w:t>
-            </w:r>
-            <w:r>
-              <w:t xml:space="preserve"> </w:t>
-            </w:r>
-            <w:r>
-              <w:t xml:space="preserve">is gone</w:t>
-            </w:r>
-          </w:p>
-        </w:tc>
-      </w:tr>
-      <w:tr>
-        <w:tc>
-          <w:tcPr/>
-          <w:p>
-            <w:pPr>
-              <w:pStyle w:val="Compact"/>
-              <w:jc w:val="left"/>
-            </w:pPr>
-            <w:r>
-              <w:t xml:space="preserve">V11.8</w:t>
-            </w:r>
-          </w:p>
-        </w:tc>
-        <w:tc>
-          <w:tcPr/>
-          <w:p>
-            <w:pPr>
-              <w:pStyle w:val="Compact"/>
-              <w:jc w:val="left"/>
-            </w:pPr>
-            <w:r>
-              <w:t xml:space="preserve">2026-09-22</w:t>
-            </w:r>
-          </w:p>
-        </w:tc>
-        <w:tc>
-          <w:tcPr/>
-          <w:p>
-            <w:pPr>
-              <w:pStyle w:val="Compact"/>
-              <w:jc w:val="left"/>
-            </w:pPr>
-            <w:r>
-              <w:t xml:space="preserve">Nghia VT</w:t>
-            </w:r>
-          </w:p>
-        </w:tc>
-        <w:tc>
-          <w:tcPr/>
-          <w:p>
-            <w:pPr>
-              <w:pStyle w:val="Compact"/>
-              <w:jc w:val="left"/>
-            </w:pPr>
-            <w:r>
-              <w:t xml:space="preserve">–</w:t>
-            </w:r>
-          </w:p>
-        </w:tc>
-        <w:tc>
-          <w:tcPr/>
-          <w:p>
-            <w:pPr>
-              <w:pStyle w:val="Compact"/>
-              <w:jc w:val="left"/>
-            </w:pPr>
-            <w:r>
-              <w:t xml:space="preserve">Question 2 restated as a shaped request, not a gap</w:t>
-            </w:r>
-          </w:p>
-        </w:tc>
-      </w:tr>
-      <w:tr>
-        <w:tc>
-          <w:tcPr/>
-          <w:p>
-            <w:pPr>
-              <w:pStyle w:val="Compact"/>
-              <w:jc w:val="left"/>
-            </w:pPr>
-            <w:r>
-              <w:t xml:space="preserve">V11.9</w:t>
-            </w:r>
-          </w:p>
-        </w:tc>
-        <w:tc>
-          <w:tcPr/>
-          <w:p>
-            <w:pPr>
-              <w:pStyle w:val="Compact"/>
-              <w:jc w:val="left"/>
-            </w:pPr>
-            <w:r>
-              <w:t xml:space="preserve">2026-09-22</w:t>
-            </w:r>
-          </w:p>
-        </w:tc>
-        <w:tc>
-          <w:tcPr/>
-          <w:p>
-            <w:pPr>
-              <w:pStyle w:val="Compact"/>
-              <w:jc w:val="left"/>
-            </w:pPr>
-            <w:r>
-              <w:t xml:space="preserve">Nghia VT</w:t>
-            </w:r>
-          </w:p>
-        </w:tc>
-        <w:tc>
-          <w:tcPr/>
-          <w:p>
-            <w:pPr>
-              <w:pStyle w:val="Compact"/>
-              <w:jc w:val="left"/>
-            </w:pPr>
-            <w:r>
-              <w:t xml:space="preserve">–</w:t>
-            </w:r>
-          </w:p>
-        </w:tc>
-        <w:tc>
-          <w:tcPr/>
-          <w:p>
-            <w:pPr>
-              <w:pStyle w:val="Compact"/>
-              <w:jc w:val="left"/>
-            </w:pPr>
-            <w:r>
-              <w:t xml:space="preserve">Last two questions take positions; specification complete</w:t>
-            </w:r>
-          </w:p>
-        </w:tc>
-      </w:tr>
-      <w:tr>
-        <w:tc>
-          <w:tcPr/>
-          <w:p>
-            <w:pPr>
-              <w:pStyle w:val="Compact"/>
-              <w:jc w:val="left"/>
-            </w:pPr>
-            <w:r>
-              <w:t xml:space="preserve">V11.10</w:t>
-            </w:r>
-          </w:p>
-        </w:tc>
-        <w:tc>
-          <w:tcPr/>
-          <w:p>
-            <w:pPr>
-              <w:pStyle w:val="Compact"/>
-              <w:jc w:val="left"/>
-            </w:pPr>
-            <w:r>
-              <w:t xml:space="preserve">2026-09-22</w:t>
-            </w:r>
-          </w:p>
-        </w:tc>
-        <w:tc>
-          <w:tcPr/>
-          <w:p>
-            <w:pPr>
-              <w:pStyle w:val="Compact"/>
-              <w:jc w:val="left"/>
-            </w:pPr>
-            <w:r>
-              <w:t xml:space="preserve">Nghia VT</w:t>
-            </w:r>
-          </w:p>
-        </w:tc>
-        <w:tc>
-          <w:tcPr/>
-          <w:p>
-            <w:pPr>
-              <w:pStyle w:val="Compact"/>
-              <w:jc w:val="left"/>
-            </w:pPr>
-            <w:r>
-              <w:t xml:space="preserve">–</w:t>
-            </w:r>
-          </w:p>
-        </w:tc>
-        <w:tc>
-          <w:tcPr/>
-          <w:p>
-            <w:pPr>
-              <w:pStyle w:val="Compact"/>
-              <w:jc w:val="left"/>
-            </w:pPr>
-            <w:r>
-              <w:t xml:space="preserve">DMA answered by its owner: level, not pulse. Central limit removed</w:t>
-            </w:r>
-          </w:p>
-        </w:tc>
-      </w:tr>
-      <w:tr>
-        <w:tc>
-          <w:tcPr/>
-          <w:p>
-            <w:pPr>
-              <w:pStyle w:val="Compact"/>
-              <w:jc w:val="left"/>
-            </w:pPr>
-            <w:r>
-              <w:rPr>
-                <w:b/>
-                <w:bCs/>
-              </w:rPr>
-              <w:t xml:space="preserve">V2.0</w:t>
-            </w:r>
-          </w:p>
-        </w:tc>
-        <w:tc>
-          <w:tcPr/>
-          <w:p>
-            <w:pPr>
-              <w:pStyle w:val="Compact"/>
-              <w:jc w:val="left"/>
-            </w:pPr>
-            <w:r>
-              <w:rPr>
-                <w:b/>
-                <w:bCs/>
-              </w:rPr>
-              <w:t xml:space="preserve">2026-09-23</w:t>
-            </w:r>
-          </w:p>
-        </w:tc>
-        <w:tc>
-          <w:tcPr/>
-          <w:p>
-            <w:pPr>
-              <w:pStyle w:val="Compact"/>
-              <w:jc w:val="left"/>
-            </w:pPr>
-            <w:r>
-              <w:rPr>
-                <w:b/>
-                <w:bCs/>
-              </w:rPr>
-              <w:t xml:space="preserve">Nghia VT</w:t>
-            </w:r>
-          </w:p>
-        </w:tc>
-        <w:tc>
-          <w:tcPr/>
-          <w:p>
-            <w:pPr>
-              <w:pStyle w:val="Compact"/>
-              <w:jc w:val="left"/>
-            </w:pPr>
-            <w:r>
-              <w:t xml:space="preserve">–</w:t>
-            </w:r>
-          </w:p>
-        </w:tc>
-        <w:tc>
-          <w:tcPr/>
-          <w:p>
-            <w:pPr>
-              <w:pStyle w:val="Compact"/>
-              <w:jc w:val="left"/>
-            </w:pPr>
-            <w:r>
-              <w:rPr>
-                <w:b/>
-                <w:bCs/>
-              </w:rPr>
-              <w:t xml:space="preserve">Rewritten as specification only: 1284 lines to 220. History and rationale moved to</w:t>
-            </w:r>
-            <w:r>
-              <w:rPr>
-                <w:b/>
-                <w:bCs/>
-              </w:rPr>
-              <w:t xml:space="preserve"> </w:t>
-            </w:r>
-            <w:r>
-              <w:rPr>
-                <w:rStyle w:val="VerbatimChar"/>
-                <w:b/>
-                <w:bCs/>
-              </w:rPr>
-              <w:t xml:space="preserve">_DECISIONS</w:t>
-            </w:r>
-            <w:r>
-              <w:rPr>
-                <w:b/>
-                <w:bCs/>
-              </w:rPr>
-              <w:t xml:space="preserve">. Tables in 7.2, 7.3 and 10 are now generated from</w:t>
-            </w:r>
-            <w:r>
-              <w:rPr>
-                <w:b/>
-                <w:bCs/>
-              </w:rPr>
-              <w:t xml:space="preserve"> </w:t>
-            </w:r>
-            <w:r>
-              <w:rPr>
-                <w:rStyle w:val="VerbatimChar"/>
-                <w:b/>
-                <w:bCs/>
               </w:rPr>
               <w:t xml:space="preserve">util/qsoc_contract.yml</w:t>
             </w:r>

</xml_diff>

<commit_message>
docs: remove the text that was sitting above the first heading
The block, owner, version and date line and the two paragraphs under it were
written before the first heading, and pandoc places the contents and the two
front lists immediately after the cover -- so that text rendered between the table
of figures and the revision history, belonging to no section and reading like part
of the figure list.

Almost all of it was already said elsewhere: owner, version and date are on the
cover and in the revision table, the pointer to _DECISIONS is in the revision
section, and the opening sentence restated section 1 in different words. The one
sentence worth keeping is now the first of section 1, together with the block
directory and module name, which were not recorded anywhere else.

The template says not to write above the first heading, and why.
</commit_message>
<xml_diff>
--- a/doc/QNSC_Interrupt_Map_MAS.docx
+++ b/doc/QNSC_Interrupt_Map_MAS.docx
@@ -188,145 +188,6 @@
         </w:p>
       </w:sdtContent>
     </w:sdt>
-    <w:p>
-      <w:pPr>
-        <w:pStyle w:val="FirstParagraph"/>
-      </w:pPr>
-      <w:r>
-        <w:rPr>
-          <w:b/>
-          <w:bCs/>
-        </w:rPr>
-        <w:t xml:space="preserve">Block</w:t>
-      </w:r>
-      <w:r>
-        <w:t xml:space="preserve"> </w:t>
-      </w:r>
-      <w:r>
-        <w:rPr>
-          <w:rStyle w:val="VerbatimChar"/>
-        </w:rPr>
-        <w:t xml:space="preserve">intmap</w:t>
-      </w:r>
-      <w:r>
-        <w:t xml:space="preserve"> </w:t>
-      </w:r>
-      <w:r>
-        <w:t xml:space="preserve">·</w:t>
-      </w:r>
-      <w:r>
-        <w:t xml:space="preserve"> </w:t>
-      </w:r>
-      <w:r>
-        <w:rPr>
-          <w:b/>
-          <w:bCs/>
-        </w:rPr>
-        <w:t xml:space="preserve">Owner</w:t>
-      </w:r>
-      <w:r>
-        <w:t xml:space="preserve"> </w:t>
-      </w:r>
-      <w:r>
-        <w:t xml:space="preserve">Nghia Van Trong ·</w:t>
-      </w:r>
-      <w:r>
-        <w:t xml:space="preserve"> </w:t>
-      </w:r>
-      <w:r>
-        <w:rPr>
-          <w:b/>
-          <w:bCs/>
-        </w:rPr>
-        <w:t xml:space="preserve">Version</w:t>
-      </w:r>
-      <w:r>
-        <w:t xml:space="preserve"> </w:t>
-      </w:r>
-      <w:r>
-        <w:t xml:space="preserve">2.0 ·</w:t>
-      </w:r>
-      <w:r>
-        <w:t xml:space="preserve"> </w:t>
-      </w:r>
-      <w:r>
-        <w:rPr>
-          <w:b/>
-          <w:bCs/>
-        </w:rPr>
-        <w:t xml:space="preserve">2026-09-23</w:t>
-      </w:r>
-    </w:p>
-    <w:p>
-      <w:pPr>
-        <w:pStyle w:val="BodyText"/>
-      </w:pPr>
-      <w:r>
-        <w:t xml:space="preserve">Twenty-seven interrupt sources reach the CPU as twelve wires.</w:t>
-      </w:r>
-      <w:r>
-        <w:t xml:space="preserve"> </w:t>
-      </w:r>
-      <w:r>
-        <w:rPr>
-          <w:rStyle w:val="VerbatimChar"/>
-        </w:rPr>
-        <w:t xml:space="preserve">INTMAP</w:t>
-      </w:r>
-      <w:r>
-        <w:t xml:space="preserve"> </w:t>
-      </w:r>
-      <w:r>
-        <w:t xml:space="preserve">is the</w:t>
-      </w:r>
-      <w:r>
-        <w:t xml:space="preserve"> </w:t>
-      </w:r>
-      <w:r>
-        <w:t xml:space="preserve">combinational OR tree that does the reduction.</w:t>
-      </w:r>
-    </w:p>
-    <w:p>
-      <w:pPr>
-        <w:pStyle w:val="BodyText"/>
-      </w:pPr>
-      <w:r>
-        <w:t xml:space="preserve">Why the specification says what it says — the two designs that were dropped, the</w:t>
-      </w:r>
-      <w:r>
-        <w:t xml:space="preserve"> </w:t>
-      </w:r>
-      <w:r>
-        <w:t xml:space="preserve">evidence read out of Ibex, the questions that closed — is in</w:t>
-      </w:r>
-      <w:r>
-        <w:t xml:space="preserve"> </w:t>
-      </w:r>
-      <w:hyperlink r:id="rId25">
-        <w:r>
-          <w:rPr>
-            <w:rStyle w:val="VerbatimChar"/>
-          </w:rPr>
-          <w:t xml:space="preserve">QNSC_Interrupt_Map_DECISIONS.md</w:t>
-        </w:r>
-      </w:hyperlink>
-      <w:r>
-        <w:t xml:space="preserve">. This file is</w:t>
-      </w:r>
-      <w:r>
-        <w:t xml:space="preserve"> </w:t>
-      </w:r>
-      <w:r>
-        <w:t xml:space="preserve">the contract.</w:t>
-      </w:r>
-    </w:p>
-    <w:p>
-      <w:r>
-        <w:pict>
-          <v:rect style="width:0;height:1.5pt" o:hralign="center" o:hrstd="t" o:hr="t"/>
-        </w:pict>
-      </w:r>
-    </w:p>
     <w:bookmarkStart w:id="26" w:name="revision-history"/>
     <w:p>
       <w:pPr>
@@ -584,6 +445,12 @@
         <w:pStyle w:val="FirstParagraph"/>
       </w:pPr>
       <w:r>
+        <w:t xml:space="preserve">Twenty-seven interrupt sources reach the CPU as twelve wires.</w:t>
+      </w:r>
+      <w:r>
+        <w:t xml:space="preserve"> </w:t>
+      </w:r>
+      <w:r>
         <w:rPr>
           <w:rStyle w:val="VerbatimChar"/>
         </w:rPr>
@@ -593,19 +460,25 @@
         <w:t xml:space="preserve"> </w:t>
       </w:r>
       <w:r>
-        <w:t xml:space="preserve">groups the interrupt sources of fourteen blocks onto the CPU’s fast</w:t>
+        <w:t xml:space="preserve">is the</w:t>
       </w:r>
       <w:r>
         <w:t xml:space="preserve"> </w:t>
       </w:r>
       <w:r>
-        <w:t xml:space="preserve">interrupt lines, one line per peripheral, and passes the watchdog bark straight</w:t>
+        <w:t xml:space="preserve">combinational OR tree that does the reduction: it groups the sources of fourteen</w:t>
       </w:r>
       <w:r>
         <w:t xml:space="preserve"> </w:t>
       </w:r>
       <w:r>
-        <w:t xml:space="preserve">through to the non-maskable input.</w:t>
+        <w:t xml:space="preserve">blocks onto the core’s fast interrupt lines, one line per peripheral, and passes</w:t>
+      </w:r>
+      <w:r>
+        <w:t xml:space="preserve"> </w:t>
+      </w:r>
+      <w:r>
+        <w:t xml:space="preserve">the watchdog bark straight through to the non-maskable input.</w:t>
       </w:r>
     </w:p>
     <w:p>
@@ -627,6 +500,70 @@
       </w:r>
       <w:r>
         <w:t xml:space="preserve">(the core does that), or latch a pulse. It has no clock and no reset.</w:t>
+      </w:r>
+    </w:p>
+    <w:p>
+      <w:pPr>
+        <w:pStyle w:val="BodyText"/>
+      </w:pPr>
+      <w:r>
+        <w:t xml:space="preserve">Block directory</w:t>
+      </w:r>
+      <w:r>
+        <w:t xml:space="preserve"> </w:t>
+      </w:r>
+      <w:r>
+        <w:rPr>
+          <w:rStyle w:val="VerbatimChar"/>
+        </w:rPr>
+        <w:t xml:space="preserve">design/intmap</w:t>
+      </w:r>
+      <w:r>
+        <w:t xml:space="preserve">, module</w:t>
+      </w:r>
+      <w:r>
+        <w:t xml:space="preserve"> </w:t>
+      </w:r>
+      <w:r>
+        <w:rPr>
+          <w:rStyle w:val="VerbatimChar"/>
+        </w:rPr>
+        <w:t xml:space="preserve">m_qnsc_intmap</w:t>
+      </w:r>
+      <w:r>
+        <w:t xml:space="preserve">, owner Nghia Van Trong.</w:t>
+      </w:r>
+      <w:r>
+        <w:t xml:space="preserve"> </w:t>
+      </w:r>
+      <w:r>
+        <w:t xml:space="preserve">Why the specification says what it says – the two designs that were dropped, the</w:t>
+      </w:r>
+      <w:r>
+        <w:t xml:space="preserve"> </w:t>
+      </w:r>
+      <w:r>
+        <w:t xml:space="preserve">evidence read out of Ibex, how each question closed – is in</w:t>
+      </w:r>
+      <w:r>
+        <w:t xml:space="preserve"> </w:t>
+      </w:r>
+      <w:hyperlink r:id="rId25">
+        <w:r>
+          <w:rPr>
+            <w:rStyle w:val="VerbatimChar"/>
+          </w:rPr>
+          <w:t xml:space="preserve">QNSC_Interrupt_Map_DECISIONS.md</w:t>
+        </w:r>
+      </w:hyperlink>
+      <w:r>
+        <w:t xml:space="preserve">. This file is</w:t>
+      </w:r>
+      <w:r>
+        <w:t xml:space="preserve"> </w:t>
+      </w:r>
+      <w:r>
+        <w:t xml:space="preserve">the contract.</w:t>
       </w:r>
     </w:p>
     <w:bookmarkEnd w:id="27"/>

</xml_diff>

<commit_message>
docs: align RAM, INTMAP, contract and sysdbg README with SYSDBG V3.0
- Contract: drop the SYSDBG 0xF000_0000 row (no memory-mapped registers
  any more), note that the debug window is a firmware convention because
  PMP is off, and use the V3.0 clock names. Regenerate qnsc_pkg.sv and
  the RAM memory-map table.
- RAM V2.1: the ISRAM array keeps its contents through every reset except
  power loss, with a check for it; PARA_ID_WD = 7 from HAS Table 5-1.
- INTMAP: the watchdog requirement no longer relies on debug_mode, which
  ibex_top does not export.
- sysdbg README: native AXI4 manager, no axi_from_mem, and a pointer to
  the reference design.
</commit_message>
<xml_diff>
--- a/doc/QNSC_Interrupt_Map_MAS.docx
+++ b/doc/QNSC_Interrupt_Map_MAS.docx
@@ -6371,7 +6371,7 @@
               <w:jc w:val="left"/>
             </w:pPr>
             <w:r>
-              <w:t xml:space="preserve">Watchdog stoppable while</w:t>
+              <w:t xml:space="preserve">Firmware disables the watchdog for a debug session. Ibex does not export</w:t>
             </w:r>
             <w:r>
               <w:t xml:space="preserve"> </w:t>
@@ -6383,38 +6383,19 @@
               <w:t xml:space="preserve">debug_mode</w:t>
             </w:r>
             <w:r>
-              <w:t xml:space="preserve"> </w:t>
-            </w:r>
-            <w:r>
-              <w:t xml:space="preserve">is asserted,</w:t>
-            </w:r>
-            <w:r>
-              <w:t xml:space="preserve"> </w:t>
-            </w:r>
-            <w:r>
-              <w:rPr>
-                <w:b/>
-                <w:bCs/>
-              </w:rPr>
-              <w:t xml:space="preserve">or</w:t>
-            </w:r>
-            <w:r>
-              <w:t xml:space="preserve"> </w:t>
-            </w:r>
-            <w:r>
-              <w:t xml:space="preserve">firmware told to disable it</w:t>
-            </w:r>
-          </w:p>
-        </w:tc>
-        <w:tc>
-          <w:tcPr/>
-          <w:p>
-            <w:pPr>
-              <w:pStyle w:val="Compact"/>
-              <w:jc w:val="left"/>
-            </w:pPr>
-            <w:r>
-              <w:t xml:space="preserve">WDT owner</w:t>
+              <w:t xml:space="preserve">, so the watchdog cannot see a halt</w:t>
+            </w:r>
+          </w:p>
+        </w:tc>
+        <w:tc>
+          <w:tcPr/>
+          <w:p>
+            <w:pPr>
+              <w:pStyle w:val="Compact"/>
+              <w:jc w:val="left"/>
+            </w:pPr>
+            <w:r>
+              <w:t xml:space="preserve">WDT owner, firmware owner</w:t>
             </w:r>
           </w:p>
         </w:tc>

</xml_diff>